<commit_message>
GUIA ACTUALIZADA CON GIT Y DRIVE
</commit_message>
<xml_diff>
--- a/GUIA WEB LOCAL.docx
+++ b/GUIA WEB LOCAL.docx
@@ -205,7 +205,6 @@
         <w:spacing w:after="240" w:before="240" w:line="240" w:lineRule="auto"/>
         <w:rPr>
           <w:rFonts w:ascii="Times New Roman" w:cs="Times New Roman" w:eastAsia="Times New Roman" w:hAnsi="Times New Roman"/>
-          <w:color w:val="1f1f1f"/>
           <w:sz w:val="24"/>
           <w:szCs w:val="24"/>
         </w:rPr>
@@ -232,59 +231,6 @@
         </w:rPr>
         <w:t xml:space="preserve"> Puntos reportados en oficinas que no se localizaron físicamente en los patch panels del rack.</w:t>
       </w:r>
-    </w:p>
-    <w:p>
-      <w:pPr>
-        <w:keepNext w:val="0"/>
-        <w:keepLines w:val="0"/>
-        <w:pageBreakBefore w:val="0"/>
-        <w:widowControl w:val="1"/>
-        <w:pBdr>
-          <w:top w:space="0" w:sz="0" w:val="nil"/>
-          <w:left w:space="0" w:sz="0" w:val="nil"/>
-          <w:bottom w:space="0" w:sz="0" w:val="nil"/>
-          <w:right w:space="0" w:sz="0" w:val="nil"/>
-          <w:between w:space="0" w:sz="0" w:val="nil"/>
-        </w:pBdr>
-        <w:shd w:fill="auto" w:val="clear"/>
-        <w:spacing w:after="160" w:before="0" w:line="240" w:lineRule="auto"/>
-        <w:ind w:left="0" w:right="0" w:firstLine="0"/>
-        <w:jc w:val="left"/>
-        <w:rPr>
-          <w:rFonts w:ascii="Times New Roman" w:cs="Times New Roman" w:eastAsia="Times New Roman" w:hAnsi="Times New Roman"/>
-          <w:sz w:val="24"/>
-          <w:szCs w:val="24"/>
-        </w:rPr>
-      </w:pPr>
-      <w:r>
-        <w:rPr>
-          <w:rtl w:val="0"/>
-        </w:rPr>
-      </w:r>
-    </w:p>
-    <w:p>
-      <w:pPr>
-        <w:keepNext w:val="0"/>
-        <w:keepLines w:val="0"/>
-        <w:pageBreakBefore w:val="0"/>
-        <w:widowControl w:val="1"/>
-        <w:pBdr>
-          <w:top w:space="0" w:sz="0" w:val="nil"/>
-          <w:left w:space="0" w:sz="0" w:val="nil"/>
-          <w:bottom w:space="0" w:sz="0" w:val="nil"/>
-          <w:right w:space="0" w:sz="0" w:val="nil"/>
-          <w:between w:space="0" w:sz="0" w:val="nil"/>
-        </w:pBdr>
-        <w:shd w:fill="auto" w:val="clear"/>
-        <w:spacing w:after="160" w:before="0" w:line="240" w:lineRule="auto"/>
-        <w:ind w:left="0" w:right="0" w:firstLine="0"/>
-        <w:jc w:val="left"/>
-        <w:rPr>
-          <w:rFonts w:ascii="Times New Roman" w:cs="Times New Roman" w:eastAsia="Times New Roman" w:hAnsi="Times New Roman"/>
-          <w:sz w:val="24"/>
-          <w:szCs w:val="24"/>
-        </w:rPr>
-      </w:pPr>
       <w:r>
         <w:rPr>
           <w:rtl w:val="0"/>
@@ -1442,7 +1388,18 @@
                 <w:vertAlign w:val="baseline"/>
                 <w:rtl w:val="0"/>
               </w:rPr>
-              <w:t xml:space="preserve">REVISORIA FISCAL(RVFIS)</w:t>
+              <w:t xml:space="preserve">REVISORIA FISCAL(RVFIS)   16.</w:t>
+            </w:r>
+            <w:r>
+              <w:rPr>
+                <w:rtl w:val="0"/>
+              </w:rPr>
+              <w:t xml:space="preserve">GERENCIA(GER)</w:t>
+            </w:r>
+            <w:r>
+              <w:rPr>
+                <w:rtl w:val="0"/>
+              </w:rPr>
             </w:r>
           </w:p>
         </w:tc>
@@ -1529,9 +1486,6 @@
         <w:rPr/>
       </w:pPr>
       <w:r>
-        <w:br w:type="page"/>
-      </w:r>
-      <w:r>
         <w:rPr>
           <w:rtl w:val="0"/>
         </w:rPr>
@@ -1539,7 +1493,10 @@
     </w:p>
     <w:p>
       <w:pPr>
-        <w:rPr/>
+        <w:rPr>
+          <w:b w:val="1"/>
+          <w:bCs w:val="1"/>
+        </w:rPr>
       </w:pPr>
       <w:r>
         <w:rPr>
@@ -1578,6 +1535,9 @@
             </a:graphic>
           </wp:inline>
         </w:drawing>
+      </w:r>
+      <w:r>
+        <w:br w:type="page"/>
       </w:r>
       <w:r>
         <w:rPr>
@@ -3667,6 +3627,19 @@
         </mc:AlternateContent>
       </w:r>
     </w:p>
+    <w:p>
+      <w:pPr>
+        <w:rPr>
+          <w:b w:val="1"/>
+          <w:bCs w:val="1"/>
+        </w:rPr>
+      </w:pPr>
+      <w:r>
+        <w:rPr>
+          <w:rtl w:val="0"/>
+        </w:rPr>
+      </w:r>
+    </w:p>
     <w:sectPr>
       <w:pgSz w:h="11906" w:w="16838" w:orient="landscape"/>
       <w:pgMar w:bottom="1701" w:top="1701" w:left="1417" w:right="1417" w:header="708" w:footer="708"/>

</xml_diff>